<commit_message>
Se agrega los RF y RNF de Mateo
</commit_message>
<xml_diff>
--- a/ESRE.docx
+++ b/ESRE.docx
@@ -1241,26 +1241,38 @@
         <w:spacing w:after="0" w:before="0" w:line="276" w:lineRule="auto"/>
         <w:ind w:left="0" w:right="0" w:firstLine="0"/>
         <w:jc w:val="left"/>
-        <w:rPr>
-          <w:rFonts w:ascii="Arial" w:cs="Arial" w:eastAsia="Arial" w:hAnsi="Arial"/>
-          <w:b w:val="0"/>
-          <w:bCs w:val="0"/>
-          <w:i w:val="0"/>
-          <w:iCs w:val="0"/>
-          <w:smallCaps w:val="0"/>
-          <w:strike w:val="0"/>
-          <w:color w:val="000000"/>
-          <w:sz w:val="22"/>
-          <w:szCs w:val="22"/>
-          <w:u w:val="none"/>
-          <w:shd w:fill="auto" w:val="clear"/>
-          <w:vertAlign w:val="baseline"/>
-        </w:rPr>
-      </w:pPr>
-      <w:r>
-        <w:rPr>
-          <w:rtl w:val="0"/>
-        </w:rPr>
+        <w:rPr/>
+      </w:pPr>
+      <w:r>
+        <w:rPr>
+          <w:rtl w:val="0"/>
+        </w:rPr>
+      </w:r>
+    </w:p>
+    <w:p>
+      <w:pPr>
+        <w:keepNext w:val="0"/>
+        <w:keepLines w:val="0"/>
+        <w:pageBreakBefore w:val="0"/>
+        <w:widowControl w:val="0"/>
+        <w:pBdr>
+          <w:top w:space="0" w:sz="0" w:val="nil"/>
+          <w:left w:space="0" w:sz="0" w:val="nil"/>
+          <w:bottom w:space="0" w:sz="0" w:val="nil"/>
+          <w:right w:space="0" w:sz="0" w:val="nil"/>
+          <w:between w:space="0" w:sz="0" w:val="nil"/>
+        </w:pBdr>
+        <w:shd w:fill="auto" w:val="clear"/>
+        <w:spacing w:after="0" w:before="0" w:line="276" w:lineRule="auto"/>
+        <w:ind w:left="0" w:right="0" w:firstLine="0"/>
+        <w:jc w:val="left"/>
+        <w:rPr/>
+      </w:pPr>
+      <w:r>
+        <w:rPr>
+          <w:rtl w:val="0"/>
+        </w:rPr>
+        <w:t xml:space="preserve">SEBA:</w:t>
       </w:r>
     </w:p>
     <w:p>
@@ -2171,84 +2183,6 @@
       </w:pPr>
       <w:r>
         <w:rPr>
-          <w:rtl w:val="0"/>
-        </w:rPr>
-      </w:r>
-    </w:p>
-    <w:p>
-      <w:pPr>
-        <w:keepNext w:val="0"/>
-        <w:keepLines w:val="0"/>
-        <w:pageBreakBefore w:val="0"/>
-        <w:widowControl w:val="0"/>
-        <w:pBdr>
-          <w:top w:space="0" w:sz="0" w:val="nil"/>
-          <w:left w:space="0" w:sz="0" w:val="nil"/>
-          <w:bottom w:space="0" w:sz="0" w:val="nil"/>
-          <w:right w:space="0" w:sz="0" w:val="nil"/>
-          <w:between w:space="0" w:sz="0" w:val="nil"/>
-        </w:pBdr>
-        <w:shd w:fill="auto" w:val="clear"/>
-        <w:spacing w:after="0" w:before="0" w:line="276" w:lineRule="auto"/>
-        <w:ind w:left="0" w:right="0" w:firstLine="0"/>
-        <w:jc w:val="left"/>
-        <w:rPr>
-          <w:rFonts w:ascii="Arial" w:cs="Arial" w:eastAsia="Arial" w:hAnsi="Arial"/>
-          <w:b w:val="0"/>
-          <w:bCs w:val="0"/>
-          <w:i w:val="0"/>
-          <w:iCs w:val="0"/>
-          <w:smallCaps w:val="0"/>
-          <w:strike w:val="0"/>
-          <w:color w:val="000000"/>
-          <w:sz w:val="22"/>
-          <w:szCs w:val="22"/>
-          <w:u w:val="none"/>
-          <w:shd w:fill="auto" w:val="clear"/>
-          <w:vertAlign w:val="baseline"/>
-        </w:rPr>
-      </w:pPr>
-      <w:r>
-        <w:rPr>
-          <w:rtl w:val="0"/>
-        </w:rPr>
-      </w:r>
-    </w:p>
-    <w:p>
-      <w:pPr>
-        <w:keepNext w:val="0"/>
-        <w:keepLines w:val="0"/>
-        <w:pageBreakBefore w:val="0"/>
-        <w:widowControl w:val="0"/>
-        <w:pBdr>
-          <w:top w:space="0" w:sz="0" w:val="nil"/>
-          <w:left w:space="0" w:sz="0" w:val="nil"/>
-          <w:bottom w:space="0" w:sz="0" w:val="nil"/>
-          <w:right w:space="0" w:sz="0" w:val="nil"/>
-          <w:between w:space="0" w:sz="0" w:val="nil"/>
-        </w:pBdr>
-        <w:shd w:fill="auto" w:val="clear"/>
-        <w:spacing w:after="0" w:before="0" w:line="276" w:lineRule="auto"/>
-        <w:ind w:left="0" w:right="0" w:firstLine="0"/>
-        <w:jc w:val="left"/>
-        <w:rPr>
-          <w:rFonts w:ascii="Arial" w:cs="Arial" w:eastAsia="Arial" w:hAnsi="Arial"/>
-          <w:b w:val="0"/>
-          <w:bCs w:val="0"/>
-          <w:i w:val="0"/>
-          <w:iCs w:val="0"/>
-          <w:smallCaps w:val="0"/>
-          <w:strike w:val="0"/>
-          <w:color w:val="000000"/>
-          <w:sz w:val="22"/>
-          <w:szCs w:val="22"/>
-          <w:u w:val="none"/>
-          <w:shd w:fill="auto" w:val="clear"/>
-          <w:vertAlign w:val="baseline"/>
-        </w:rPr>
-      </w:pPr>
-      <w:r>
-        <w:rPr>
           <w:rFonts w:ascii="Arial" w:cs="Arial" w:eastAsia="Arial" w:hAnsi="Arial"/>
           <w:b w:val="0"/>
           <w:bCs w:val="0"/>
@@ -3083,357 +3017,6 @@
       </w:pPr>
       <w:r>
         <w:rPr>
-          <w:rtl w:val="0"/>
-        </w:rPr>
-      </w:r>
-    </w:p>
-    <w:p>
-      <w:pPr>
-        <w:keepNext w:val="0"/>
-        <w:keepLines w:val="0"/>
-        <w:pageBreakBefore w:val="0"/>
-        <w:widowControl w:val="0"/>
-        <w:pBdr>
-          <w:top w:space="0" w:sz="0" w:val="nil"/>
-          <w:left w:space="0" w:sz="0" w:val="nil"/>
-          <w:bottom w:space="0" w:sz="0" w:val="nil"/>
-          <w:right w:space="0" w:sz="0" w:val="nil"/>
-          <w:between w:space="0" w:sz="0" w:val="nil"/>
-        </w:pBdr>
-        <w:shd w:fill="auto" w:val="clear"/>
-        <w:spacing w:after="0" w:before="0" w:line="276" w:lineRule="auto"/>
-        <w:ind w:left="0" w:right="0" w:firstLine="0"/>
-        <w:jc w:val="left"/>
-        <w:rPr>
-          <w:rFonts w:ascii="Arial" w:cs="Arial" w:eastAsia="Arial" w:hAnsi="Arial"/>
-          <w:b w:val="0"/>
-          <w:bCs w:val="0"/>
-          <w:i w:val="0"/>
-          <w:iCs w:val="0"/>
-          <w:smallCaps w:val="0"/>
-          <w:strike w:val="0"/>
-          <w:color w:val="000000"/>
-          <w:sz w:val="22"/>
-          <w:szCs w:val="22"/>
-          <w:u w:val="none"/>
-          <w:shd w:fill="auto" w:val="clear"/>
-          <w:vertAlign w:val="baseline"/>
-        </w:rPr>
-      </w:pPr>
-      <w:r>
-        <w:rPr>
-          <w:rtl w:val="0"/>
-        </w:rPr>
-      </w:r>
-    </w:p>
-    <w:p>
-      <w:pPr>
-        <w:keepNext w:val="0"/>
-        <w:keepLines w:val="0"/>
-        <w:pageBreakBefore w:val="0"/>
-        <w:widowControl w:val="0"/>
-        <w:pBdr>
-          <w:top w:space="0" w:sz="0" w:val="nil"/>
-          <w:left w:space="0" w:sz="0" w:val="nil"/>
-          <w:bottom w:space="0" w:sz="0" w:val="nil"/>
-          <w:right w:space="0" w:sz="0" w:val="nil"/>
-          <w:between w:space="0" w:sz="0" w:val="nil"/>
-        </w:pBdr>
-        <w:shd w:fill="auto" w:val="clear"/>
-        <w:spacing w:after="0" w:before="0" w:line="276" w:lineRule="auto"/>
-        <w:ind w:left="0" w:right="0" w:firstLine="0"/>
-        <w:jc w:val="left"/>
-        <w:rPr>
-          <w:rFonts w:ascii="Arial" w:cs="Arial" w:eastAsia="Arial" w:hAnsi="Arial"/>
-          <w:b w:val="0"/>
-          <w:bCs w:val="0"/>
-          <w:i w:val="0"/>
-          <w:iCs w:val="0"/>
-          <w:smallCaps w:val="0"/>
-          <w:strike w:val="0"/>
-          <w:color w:val="000000"/>
-          <w:sz w:val="22"/>
-          <w:szCs w:val="22"/>
-          <w:u w:val="none"/>
-          <w:shd w:fill="auto" w:val="clear"/>
-          <w:vertAlign w:val="baseline"/>
-        </w:rPr>
-      </w:pPr>
-      <w:r>
-        <w:rPr>
-          <w:rtl w:val="0"/>
-        </w:rPr>
-      </w:r>
-    </w:p>
-    <w:p>
-      <w:pPr>
-        <w:keepNext w:val="0"/>
-        <w:keepLines w:val="0"/>
-        <w:pageBreakBefore w:val="0"/>
-        <w:widowControl w:val="0"/>
-        <w:pBdr>
-          <w:top w:space="0" w:sz="0" w:val="nil"/>
-          <w:left w:space="0" w:sz="0" w:val="nil"/>
-          <w:bottom w:space="0" w:sz="0" w:val="nil"/>
-          <w:right w:space="0" w:sz="0" w:val="nil"/>
-          <w:between w:space="0" w:sz="0" w:val="nil"/>
-        </w:pBdr>
-        <w:shd w:fill="auto" w:val="clear"/>
-        <w:spacing w:after="0" w:before="0" w:line="276" w:lineRule="auto"/>
-        <w:ind w:left="0" w:right="0" w:firstLine="0"/>
-        <w:jc w:val="left"/>
-        <w:rPr>
-          <w:rFonts w:ascii="Arial" w:cs="Arial" w:eastAsia="Arial" w:hAnsi="Arial"/>
-          <w:b w:val="0"/>
-          <w:bCs w:val="0"/>
-          <w:i w:val="0"/>
-          <w:iCs w:val="0"/>
-          <w:smallCaps w:val="0"/>
-          <w:strike w:val="0"/>
-          <w:color w:val="000000"/>
-          <w:sz w:val="22"/>
-          <w:szCs w:val="22"/>
-          <w:u w:val="none"/>
-          <w:shd w:fill="auto" w:val="clear"/>
-          <w:vertAlign w:val="baseline"/>
-        </w:rPr>
-      </w:pPr>
-      <w:r>
-        <w:rPr>
-          <w:rtl w:val="0"/>
-        </w:rPr>
-      </w:r>
-    </w:p>
-    <w:p>
-      <w:pPr>
-        <w:keepNext w:val="0"/>
-        <w:keepLines w:val="0"/>
-        <w:pageBreakBefore w:val="0"/>
-        <w:widowControl w:val="0"/>
-        <w:pBdr>
-          <w:top w:space="0" w:sz="0" w:val="nil"/>
-          <w:left w:space="0" w:sz="0" w:val="nil"/>
-          <w:bottom w:space="0" w:sz="0" w:val="nil"/>
-          <w:right w:space="0" w:sz="0" w:val="nil"/>
-          <w:between w:space="0" w:sz="0" w:val="nil"/>
-        </w:pBdr>
-        <w:shd w:fill="auto" w:val="clear"/>
-        <w:spacing w:after="0" w:before="0" w:line="276" w:lineRule="auto"/>
-        <w:ind w:left="0" w:right="0" w:firstLine="0"/>
-        <w:jc w:val="left"/>
-        <w:rPr>
-          <w:rFonts w:ascii="Arial" w:cs="Arial" w:eastAsia="Arial" w:hAnsi="Arial"/>
-          <w:b w:val="0"/>
-          <w:bCs w:val="0"/>
-          <w:i w:val="0"/>
-          <w:iCs w:val="0"/>
-          <w:smallCaps w:val="0"/>
-          <w:strike w:val="0"/>
-          <w:color w:val="000000"/>
-          <w:sz w:val="22"/>
-          <w:szCs w:val="22"/>
-          <w:u w:val="none"/>
-          <w:shd w:fill="auto" w:val="clear"/>
-          <w:vertAlign w:val="baseline"/>
-        </w:rPr>
-      </w:pPr>
-      <w:r>
-        <w:rPr>
-          <w:rtl w:val="0"/>
-        </w:rPr>
-      </w:r>
-    </w:p>
-    <w:p>
-      <w:pPr>
-        <w:keepNext w:val="0"/>
-        <w:keepLines w:val="0"/>
-        <w:pageBreakBefore w:val="0"/>
-        <w:widowControl w:val="0"/>
-        <w:pBdr>
-          <w:top w:space="0" w:sz="0" w:val="nil"/>
-          <w:left w:space="0" w:sz="0" w:val="nil"/>
-          <w:bottom w:space="0" w:sz="0" w:val="nil"/>
-          <w:right w:space="0" w:sz="0" w:val="nil"/>
-          <w:between w:space="0" w:sz="0" w:val="nil"/>
-        </w:pBdr>
-        <w:shd w:fill="auto" w:val="clear"/>
-        <w:spacing w:after="0" w:before="0" w:line="276" w:lineRule="auto"/>
-        <w:ind w:left="0" w:right="0" w:firstLine="0"/>
-        <w:jc w:val="left"/>
-        <w:rPr>
-          <w:rFonts w:ascii="Arial" w:cs="Arial" w:eastAsia="Arial" w:hAnsi="Arial"/>
-          <w:b w:val="0"/>
-          <w:bCs w:val="0"/>
-          <w:i w:val="0"/>
-          <w:iCs w:val="0"/>
-          <w:smallCaps w:val="0"/>
-          <w:strike w:val="0"/>
-          <w:color w:val="000000"/>
-          <w:sz w:val="22"/>
-          <w:szCs w:val="22"/>
-          <w:u w:val="none"/>
-          <w:shd w:fill="auto" w:val="clear"/>
-          <w:vertAlign w:val="baseline"/>
-        </w:rPr>
-      </w:pPr>
-      <w:r>
-        <w:rPr>
-          <w:rtl w:val="0"/>
-        </w:rPr>
-      </w:r>
-    </w:p>
-    <w:p>
-      <w:pPr>
-        <w:keepNext w:val="0"/>
-        <w:keepLines w:val="0"/>
-        <w:pageBreakBefore w:val="0"/>
-        <w:widowControl w:val="0"/>
-        <w:pBdr>
-          <w:top w:space="0" w:sz="0" w:val="nil"/>
-          <w:left w:space="0" w:sz="0" w:val="nil"/>
-          <w:bottom w:space="0" w:sz="0" w:val="nil"/>
-          <w:right w:space="0" w:sz="0" w:val="nil"/>
-          <w:between w:space="0" w:sz="0" w:val="nil"/>
-        </w:pBdr>
-        <w:shd w:fill="auto" w:val="clear"/>
-        <w:spacing w:after="0" w:before="0" w:line="276" w:lineRule="auto"/>
-        <w:ind w:left="0" w:right="0" w:firstLine="0"/>
-        <w:jc w:val="left"/>
-        <w:rPr>
-          <w:rFonts w:ascii="Arial" w:cs="Arial" w:eastAsia="Arial" w:hAnsi="Arial"/>
-          <w:b w:val="0"/>
-          <w:bCs w:val="0"/>
-          <w:i w:val="0"/>
-          <w:iCs w:val="0"/>
-          <w:smallCaps w:val="0"/>
-          <w:strike w:val="0"/>
-          <w:color w:val="000000"/>
-          <w:sz w:val="22"/>
-          <w:szCs w:val="22"/>
-          <w:u w:val="none"/>
-          <w:shd w:fill="auto" w:val="clear"/>
-          <w:vertAlign w:val="baseline"/>
-        </w:rPr>
-      </w:pPr>
-      <w:r>
-        <w:rPr>
-          <w:rtl w:val="0"/>
-        </w:rPr>
-      </w:r>
-    </w:p>
-    <w:p>
-      <w:pPr>
-        <w:keepNext w:val="0"/>
-        <w:keepLines w:val="0"/>
-        <w:pageBreakBefore w:val="0"/>
-        <w:widowControl w:val="0"/>
-        <w:pBdr>
-          <w:top w:space="0" w:sz="0" w:val="nil"/>
-          <w:left w:space="0" w:sz="0" w:val="nil"/>
-          <w:bottom w:space="0" w:sz="0" w:val="nil"/>
-          <w:right w:space="0" w:sz="0" w:val="nil"/>
-          <w:between w:space="0" w:sz="0" w:val="nil"/>
-        </w:pBdr>
-        <w:shd w:fill="auto" w:val="clear"/>
-        <w:spacing w:after="0" w:before="0" w:line="276" w:lineRule="auto"/>
-        <w:ind w:left="0" w:right="0" w:firstLine="0"/>
-        <w:jc w:val="left"/>
-        <w:rPr>
-          <w:rFonts w:ascii="Arial" w:cs="Arial" w:eastAsia="Arial" w:hAnsi="Arial"/>
-          <w:b w:val="0"/>
-          <w:bCs w:val="0"/>
-          <w:i w:val="0"/>
-          <w:iCs w:val="0"/>
-          <w:smallCaps w:val="0"/>
-          <w:strike w:val="0"/>
-          <w:color w:val="000000"/>
-          <w:sz w:val="22"/>
-          <w:szCs w:val="22"/>
-          <w:u w:val="none"/>
-          <w:shd w:fill="auto" w:val="clear"/>
-          <w:vertAlign w:val="baseline"/>
-        </w:rPr>
-      </w:pPr>
-      <w:r>
-        <w:rPr>
-          <w:rtl w:val="0"/>
-        </w:rPr>
-      </w:r>
-    </w:p>
-    <w:p>
-      <w:pPr>
-        <w:keepNext w:val="0"/>
-        <w:keepLines w:val="0"/>
-        <w:pageBreakBefore w:val="0"/>
-        <w:widowControl w:val="0"/>
-        <w:pBdr>
-          <w:top w:space="0" w:sz="0" w:val="nil"/>
-          <w:left w:space="0" w:sz="0" w:val="nil"/>
-          <w:bottom w:space="0" w:sz="0" w:val="nil"/>
-          <w:right w:space="0" w:sz="0" w:val="nil"/>
-          <w:between w:space="0" w:sz="0" w:val="nil"/>
-        </w:pBdr>
-        <w:shd w:fill="auto" w:val="clear"/>
-        <w:spacing w:after="0" w:before="0" w:line="276" w:lineRule="auto"/>
-        <w:ind w:left="0" w:right="0" w:firstLine="0"/>
-        <w:jc w:val="left"/>
-        <w:rPr>
-          <w:rFonts w:ascii="Arial" w:cs="Arial" w:eastAsia="Arial" w:hAnsi="Arial"/>
-          <w:b w:val="0"/>
-          <w:bCs w:val="0"/>
-          <w:i w:val="0"/>
-          <w:iCs w:val="0"/>
-          <w:smallCaps w:val="0"/>
-          <w:strike w:val="0"/>
-          <w:color w:val="000000"/>
-          <w:sz w:val="22"/>
-          <w:szCs w:val="22"/>
-          <w:u w:val="none"/>
-          <w:shd w:fill="auto" w:val="clear"/>
-          <w:vertAlign w:val="baseline"/>
-        </w:rPr>
-      </w:pPr>
-      <w:r>
-        <w:rPr>
-          <w:rtl w:val="0"/>
-        </w:rPr>
-      </w:r>
-    </w:p>
-    <w:p>
-      <w:pPr>
-        <w:keepNext w:val="0"/>
-        <w:keepLines w:val="0"/>
-        <w:pageBreakBefore w:val="0"/>
-        <w:widowControl w:val="0"/>
-        <w:pBdr>
-          <w:top w:space="0" w:sz="0" w:val="nil"/>
-          <w:left w:space="0" w:sz="0" w:val="nil"/>
-          <w:bottom w:space="0" w:sz="0" w:val="nil"/>
-          <w:right w:space="0" w:sz="0" w:val="nil"/>
-          <w:between w:space="0" w:sz="0" w:val="nil"/>
-        </w:pBdr>
-        <w:shd w:fill="auto" w:val="clear"/>
-        <w:spacing w:after="0" w:before="0" w:line="276" w:lineRule="auto"/>
-        <w:ind w:left="0" w:right="0" w:firstLine="0"/>
-        <w:jc w:val="left"/>
-        <w:rPr>
-          <w:rFonts w:ascii="Arial" w:cs="Arial" w:eastAsia="Arial" w:hAnsi="Arial"/>
-          <w:b w:val="0"/>
-          <w:bCs w:val="0"/>
-          <w:i w:val="0"/>
-          <w:iCs w:val="0"/>
-          <w:smallCaps w:val="0"/>
-          <w:strike w:val="0"/>
-          <w:color w:val="000000"/>
-          <w:sz w:val="22"/>
-          <w:szCs w:val="22"/>
-          <w:u w:val="none"/>
-          <w:shd w:fill="auto" w:val="clear"/>
-          <w:vertAlign w:val="baseline"/>
-        </w:rPr>
-      </w:pPr>
-      <w:r>
-        <w:rPr>
           <w:rFonts w:ascii="Arial" w:cs="Arial" w:eastAsia="Arial" w:hAnsi="Arial"/>
           <w:b w:val="0"/>
           <w:bCs w:val="0"/>
@@ -4215,201 +3798,6 @@
       </w:pPr>
       <w:r>
         <w:rPr>
-          <w:rtl w:val="0"/>
-        </w:rPr>
-      </w:r>
-    </w:p>
-    <w:p>
-      <w:pPr>
-        <w:keepNext w:val="0"/>
-        <w:keepLines w:val="0"/>
-        <w:pageBreakBefore w:val="0"/>
-        <w:widowControl w:val="0"/>
-        <w:pBdr>
-          <w:top w:space="0" w:sz="0" w:val="nil"/>
-          <w:left w:space="0" w:sz="0" w:val="nil"/>
-          <w:bottom w:space="0" w:sz="0" w:val="nil"/>
-          <w:right w:space="0" w:sz="0" w:val="nil"/>
-          <w:between w:space="0" w:sz="0" w:val="nil"/>
-        </w:pBdr>
-        <w:shd w:fill="auto" w:val="clear"/>
-        <w:spacing w:after="0" w:before="0" w:line="276" w:lineRule="auto"/>
-        <w:ind w:left="0" w:right="0" w:firstLine="0"/>
-        <w:jc w:val="left"/>
-        <w:rPr>
-          <w:rFonts w:ascii="Arial" w:cs="Arial" w:eastAsia="Arial" w:hAnsi="Arial"/>
-          <w:b w:val="0"/>
-          <w:bCs w:val="0"/>
-          <w:i w:val="0"/>
-          <w:iCs w:val="0"/>
-          <w:smallCaps w:val="0"/>
-          <w:strike w:val="0"/>
-          <w:color w:val="000000"/>
-          <w:sz w:val="22"/>
-          <w:szCs w:val="22"/>
-          <w:u w:val="none"/>
-          <w:shd w:fill="auto" w:val="clear"/>
-          <w:vertAlign w:val="baseline"/>
-        </w:rPr>
-      </w:pPr>
-      <w:r>
-        <w:rPr>
-          <w:rtl w:val="0"/>
-        </w:rPr>
-      </w:r>
-    </w:p>
-    <w:p>
-      <w:pPr>
-        <w:keepNext w:val="0"/>
-        <w:keepLines w:val="0"/>
-        <w:pageBreakBefore w:val="0"/>
-        <w:widowControl w:val="0"/>
-        <w:pBdr>
-          <w:top w:space="0" w:sz="0" w:val="nil"/>
-          <w:left w:space="0" w:sz="0" w:val="nil"/>
-          <w:bottom w:space="0" w:sz="0" w:val="nil"/>
-          <w:right w:space="0" w:sz="0" w:val="nil"/>
-          <w:between w:space="0" w:sz="0" w:val="nil"/>
-        </w:pBdr>
-        <w:shd w:fill="auto" w:val="clear"/>
-        <w:spacing w:after="0" w:before="0" w:line="276" w:lineRule="auto"/>
-        <w:ind w:left="0" w:right="0" w:firstLine="0"/>
-        <w:jc w:val="left"/>
-        <w:rPr>
-          <w:rFonts w:ascii="Arial" w:cs="Arial" w:eastAsia="Arial" w:hAnsi="Arial"/>
-          <w:b w:val="0"/>
-          <w:bCs w:val="0"/>
-          <w:i w:val="0"/>
-          <w:iCs w:val="0"/>
-          <w:smallCaps w:val="0"/>
-          <w:strike w:val="0"/>
-          <w:color w:val="000000"/>
-          <w:sz w:val="22"/>
-          <w:szCs w:val="22"/>
-          <w:u w:val="none"/>
-          <w:shd w:fill="auto" w:val="clear"/>
-          <w:vertAlign w:val="baseline"/>
-        </w:rPr>
-      </w:pPr>
-      <w:r>
-        <w:rPr>
-          <w:rtl w:val="0"/>
-        </w:rPr>
-      </w:r>
-    </w:p>
-    <w:p>
-      <w:pPr>
-        <w:keepNext w:val="0"/>
-        <w:keepLines w:val="0"/>
-        <w:pageBreakBefore w:val="0"/>
-        <w:widowControl w:val="0"/>
-        <w:pBdr>
-          <w:top w:space="0" w:sz="0" w:val="nil"/>
-          <w:left w:space="0" w:sz="0" w:val="nil"/>
-          <w:bottom w:space="0" w:sz="0" w:val="nil"/>
-          <w:right w:space="0" w:sz="0" w:val="nil"/>
-          <w:between w:space="0" w:sz="0" w:val="nil"/>
-        </w:pBdr>
-        <w:shd w:fill="auto" w:val="clear"/>
-        <w:spacing w:after="0" w:before="0" w:line="276" w:lineRule="auto"/>
-        <w:ind w:left="0" w:right="0" w:firstLine="0"/>
-        <w:jc w:val="left"/>
-        <w:rPr>
-          <w:rFonts w:ascii="Arial" w:cs="Arial" w:eastAsia="Arial" w:hAnsi="Arial"/>
-          <w:b w:val="0"/>
-          <w:bCs w:val="0"/>
-          <w:i w:val="0"/>
-          <w:iCs w:val="0"/>
-          <w:smallCaps w:val="0"/>
-          <w:strike w:val="0"/>
-          <w:color w:val="000000"/>
-          <w:sz w:val="22"/>
-          <w:szCs w:val="22"/>
-          <w:u w:val="none"/>
-          <w:shd w:fill="auto" w:val="clear"/>
-          <w:vertAlign w:val="baseline"/>
-        </w:rPr>
-      </w:pPr>
-      <w:r>
-        <w:rPr>
-          <w:rtl w:val="0"/>
-        </w:rPr>
-      </w:r>
-    </w:p>
-    <w:p>
-      <w:pPr>
-        <w:keepNext w:val="0"/>
-        <w:keepLines w:val="0"/>
-        <w:pageBreakBefore w:val="0"/>
-        <w:widowControl w:val="0"/>
-        <w:pBdr>
-          <w:top w:space="0" w:sz="0" w:val="nil"/>
-          <w:left w:space="0" w:sz="0" w:val="nil"/>
-          <w:bottom w:space="0" w:sz="0" w:val="nil"/>
-          <w:right w:space="0" w:sz="0" w:val="nil"/>
-          <w:between w:space="0" w:sz="0" w:val="nil"/>
-        </w:pBdr>
-        <w:shd w:fill="auto" w:val="clear"/>
-        <w:spacing w:after="0" w:before="0" w:line="276" w:lineRule="auto"/>
-        <w:ind w:left="0" w:right="0" w:firstLine="0"/>
-        <w:jc w:val="left"/>
-        <w:rPr>
-          <w:rFonts w:ascii="Arial" w:cs="Arial" w:eastAsia="Arial" w:hAnsi="Arial"/>
-          <w:b w:val="0"/>
-          <w:bCs w:val="0"/>
-          <w:i w:val="0"/>
-          <w:iCs w:val="0"/>
-          <w:smallCaps w:val="0"/>
-          <w:strike w:val="0"/>
-          <w:color w:val="000000"/>
-          <w:sz w:val="22"/>
-          <w:szCs w:val="22"/>
-          <w:u w:val="none"/>
-          <w:shd w:fill="auto" w:val="clear"/>
-          <w:vertAlign w:val="baseline"/>
-        </w:rPr>
-      </w:pPr>
-      <w:r>
-        <w:rPr>
-          <w:rtl w:val="0"/>
-        </w:rPr>
-      </w:r>
-    </w:p>
-    <w:p>
-      <w:pPr>
-        <w:keepNext w:val="0"/>
-        <w:keepLines w:val="0"/>
-        <w:pageBreakBefore w:val="0"/>
-        <w:widowControl w:val="0"/>
-        <w:pBdr>
-          <w:top w:space="0" w:sz="0" w:val="nil"/>
-          <w:left w:space="0" w:sz="0" w:val="nil"/>
-          <w:bottom w:space="0" w:sz="0" w:val="nil"/>
-          <w:right w:space="0" w:sz="0" w:val="nil"/>
-          <w:between w:space="0" w:sz="0" w:val="nil"/>
-        </w:pBdr>
-        <w:shd w:fill="auto" w:val="clear"/>
-        <w:spacing w:after="0" w:before="0" w:line="276" w:lineRule="auto"/>
-        <w:ind w:left="0" w:right="0" w:firstLine="0"/>
-        <w:jc w:val="left"/>
-        <w:rPr>
-          <w:rFonts w:ascii="Arial" w:cs="Arial" w:eastAsia="Arial" w:hAnsi="Arial"/>
-          <w:b w:val="0"/>
-          <w:bCs w:val="0"/>
-          <w:i w:val="0"/>
-          <w:iCs w:val="0"/>
-          <w:smallCaps w:val="0"/>
-          <w:strike w:val="0"/>
-          <w:color w:val="000000"/>
-          <w:sz w:val="22"/>
-          <w:szCs w:val="22"/>
-          <w:u w:val="none"/>
-          <w:shd w:fill="auto" w:val="clear"/>
-          <w:vertAlign w:val="baseline"/>
-        </w:rPr>
-      </w:pPr>
-      <w:r>
-        <w:rPr>
           <w:rFonts w:ascii="Arial" w:cs="Arial" w:eastAsia="Arial" w:hAnsi="Arial"/>
           <w:b w:val="0"/>
           <w:bCs w:val="0"/>
@@ -5134,6 +4522,522 @@
         <w:spacing w:after="0" w:before="0" w:line="276" w:lineRule="auto"/>
         <w:ind w:left="0" w:right="0" w:firstLine="0"/>
         <w:jc w:val="left"/>
+        <w:rPr/>
+      </w:pPr>
+      <w:r>
+        <w:rPr>
+          <w:rtl w:val="0"/>
+        </w:rPr>
+      </w:r>
+    </w:p>
+    <w:p>
+      <w:pPr>
+        <w:keepNext w:val="0"/>
+        <w:keepLines w:val="0"/>
+        <w:pageBreakBefore w:val="0"/>
+        <w:widowControl w:val="0"/>
+        <w:pBdr>
+          <w:top w:space="0" w:sz="0" w:val="nil"/>
+          <w:left w:space="0" w:sz="0" w:val="nil"/>
+          <w:bottom w:space="0" w:sz="0" w:val="nil"/>
+          <w:right w:space="0" w:sz="0" w:val="nil"/>
+          <w:between w:space="0" w:sz="0" w:val="nil"/>
+        </w:pBdr>
+        <w:shd w:fill="auto" w:val="clear"/>
+        <w:spacing w:after="0" w:before="0" w:line="276" w:lineRule="auto"/>
+        <w:ind w:left="0" w:right="0" w:firstLine="0"/>
+        <w:jc w:val="left"/>
+        <w:rPr/>
+      </w:pPr>
+      <w:r>
+        <w:rPr>
+          <w:rtl w:val="0"/>
+        </w:rPr>
+      </w:r>
+    </w:p>
+    <w:p>
+      <w:pPr>
+        <w:keepNext w:val="0"/>
+        <w:keepLines w:val="0"/>
+        <w:pageBreakBefore w:val="0"/>
+        <w:widowControl w:val="0"/>
+        <w:pBdr>
+          <w:top w:space="0" w:sz="0" w:val="nil"/>
+          <w:left w:space="0" w:sz="0" w:val="nil"/>
+          <w:bottom w:space="0" w:sz="0" w:val="nil"/>
+          <w:right w:space="0" w:sz="0" w:val="nil"/>
+          <w:between w:space="0" w:sz="0" w:val="nil"/>
+        </w:pBdr>
+        <w:shd w:fill="auto" w:val="clear"/>
+        <w:spacing w:after="0" w:before="0" w:line="276" w:lineRule="auto"/>
+        <w:ind w:left="0" w:right="0" w:firstLine="0"/>
+        <w:jc w:val="left"/>
+        <w:rPr/>
+      </w:pPr>
+      <w:r>
+        <w:rPr>
+          <w:rtl w:val="0"/>
+        </w:rPr>
+        <w:t xml:space="preserve">MATEO:</w:t>
+      </w:r>
+    </w:p>
+    <w:p>
+      <w:pPr>
+        <w:keepNext w:val="0"/>
+        <w:keepLines w:val="0"/>
+        <w:pageBreakBefore w:val="0"/>
+        <w:widowControl w:val="0"/>
+        <w:pBdr>
+          <w:top w:space="0" w:sz="0" w:val="nil"/>
+          <w:left w:space="0" w:sz="0" w:val="nil"/>
+          <w:bottom w:space="0" w:sz="0" w:val="nil"/>
+          <w:right w:space="0" w:sz="0" w:val="nil"/>
+          <w:between w:space="0" w:sz="0" w:val="nil"/>
+        </w:pBdr>
+        <w:shd w:fill="auto" w:val="clear"/>
+        <w:spacing w:after="0" w:before="0" w:line="276" w:lineRule="auto"/>
+        <w:ind w:left="0" w:right="0" w:firstLine="0"/>
+        <w:jc w:val="left"/>
+        <w:rPr/>
+      </w:pPr>
+      <w:r>
+        <w:rPr>
+          <w:rtl w:val="0"/>
+        </w:rPr>
+        <w:t xml:space="preserve">RF1 – Solicitud de Afiliación Web</w:t>
+      </w:r>
+    </w:p>
+    <w:p>
+      <w:pPr>
+        <w:keepNext w:val="0"/>
+        <w:keepLines w:val="0"/>
+        <w:pageBreakBefore w:val="0"/>
+        <w:widowControl w:val="0"/>
+        <w:pBdr>
+          <w:top w:space="0" w:sz="0" w:val="nil"/>
+          <w:left w:space="0" w:sz="0" w:val="nil"/>
+          <w:bottom w:space="0" w:sz="0" w:val="nil"/>
+          <w:right w:space="0" w:sz="0" w:val="nil"/>
+          <w:between w:space="0" w:sz="0" w:val="nil"/>
+        </w:pBdr>
+        <w:shd w:fill="auto" w:val="clear"/>
+        <w:spacing w:after="0" w:before="0" w:line="276" w:lineRule="auto"/>
+        <w:ind w:left="0" w:right="0" w:firstLine="0"/>
+        <w:jc w:val="left"/>
+        <w:rPr/>
+      </w:pPr>
+      <w:r>
+        <w:rPr>
+          <w:rtl w:val="0"/>
+        </w:rPr>
+        <w:t xml:space="preserve">Descripción: Permite al interesado completar un formulario web con sus datos para solicitar la afiliación.</w:t>
+      </w:r>
+    </w:p>
+    <w:p>
+      <w:pPr>
+        <w:keepNext w:val="0"/>
+        <w:keepLines w:val="0"/>
+        <w:pageBreakBefore w:val="0"/>
+        <w:widowControl w:val="0"/>
+        <w:pBdr>
+          <w:top w:space="0" w:sz="0" w:val="nil"/>
+          <w:left w:space="0" w:sz="0" w:val="nil"/>
+          <w:bottom w:space="0" w:sz="0" w:val="nil"/>
+          <w:right w:space="0" w:sz="0" w:val="nil"/>
+          <w:between w:space="0" w:sz="0" w:val="nil"/>
+        </w:pBdr>
+        <w:shd w:fill="auto" w:val="clear"/>
+        <w:spacing w:after="0" w:before="0" w:line="276" w:lineRule="auto"/>
+        <w:ind w:left="0" w:right="0" w:firstLine="0"/>
+        <w:jc w:val="left"/>
+        <w:rPr/>
+      </w:pPr>
+      <w:r>
+        <w:rPr>
+          <w:rtl w:val="0"/>
+        </w:rPr>
+        <w:t xml:space="preserve">Prioridad: Alta.</w:t>
+      </w:r>
+    </w:p>
+    <w:p>
+      <w:pPr>
+        <w:keepNext w:val="0"/>
+        <w:keepLines w:val="0"/>
+        <w:pageBreakBefore w:val="0"/>
+        <w:widowControl w:val="0"/>
+        <w:pBdr>
+          <w:top w:space="0" w:sz="0" w:val="nil"/>
+          <w:left w:space="0" w:sz="0" w:val="nil"/>
+          <w:bottom w:space="0" w:sz="0" w:val="nil"/>
+          <w:right w:space="0" w:sz="0" w:val="nil"/>
+          <w:between w:space="0" w:sz="0" w:val="nil"/>
+        </w:pBdr>
+        <w:shd w:fill="auto" w:val="clear"/>
+        <w:spacing w:after="0" w:before="0" w:line="276" w:lineRule="auto"/>
+        <w:ind w:left="0" w:right="0" w:firstLine="0"/>
+        <w:jc w:val="left"/>
+        <w:rPr/>
+      </w:pPr>
+      <w:r>
+        <w:rPr>
+          <w:rtl w:val="0"/>
+        </w:rPr>
+        <w:t xml:space="preserve">Estímulo: El interesado accede al sitio web y selecciona la opción "Solicitar afiliación".</w:t>
+      </w:r>
+    </w:p>
+    <w:p>
+      <w:pPr>
+        <w:keepNext w:val="0"/>
+        <w:keepLines w:val="0"/>
+        <w:pageBreakBefore w:val="0"/>
+        <w:widowControl w:val="0"/>
+        <w:pBdr>
+          <w:top w:space="0" w:sz="0" w:val="nil"/>
+          <w:left w:space="0" w:sz="0" w:val="nil"/>
+          <w:bottom w:space="0" w:sz="0" w:val="nil"/>
+          <w:right w:space="0" w:sz="0" w:val="nil"/>
+          <w:between w:space="0" w:sz="0" w:val="nil"/>
+        </w:pBdr>
+        <w:shd w:fill="auto" w:val="clear"/>
+        <w:spacing w:after="0" w:before="0" w:line="276" w:lineRule="auto"/>
+        <w:ind w:left="0" w:right="0" w:firstLine="0"/>
+        <w:jc w:val="left"/>
+        <w:rPr/>
+      </w:pPr>
+      <w:r>
+        <w:rPr>
+          <w:rtl w:val="0"/>
+        </w:rPr>
+        <w:t xml:space="preserve">Comportamiento esperado del sistema: El sistema valida que los datos obligatorios estén completos, registra la solicitud con estado "Pendiente", genera un número identificador y confirma que la solicitud fue enviada correctamente.</w:t>
+      </w:r>
+    </w:p>
+    <w:p>
+      <w:pPr>
+        <w:keepNext w:val="0"/>
+        <w:keepLines w:val="0"/>
+        <w:pageBreakBefore w:val="0"/>
+        <w:widowControl w:val="0"/>
+        <w:pBdr>
+          <w:top w:space="0" w:sz="0" w:val="nil"/>
+          <w:left w:space="0" w:sz="0" w:val="nil"/>
+          <w:bottom w:space="0" w:sz="0" w:val="nil"/>
+          <w:right w:space="0" w:sz="0" w:val="nil"/>
+          <w:between w:space="0" w:sz="0" w:val="nil"/>
+        </w:pBdr>
+        <w:shd w:fill="auto" w:val="clear"/>
+        <w:spacing w:after="0" w:before="0" w:line="276" w:lineRule="auto"/>
+        <w:ind w:left="0" w:right="0" w:firstLine="0"/>
+        <w:jc w:val="left"/>
+        <w:rPr/>
+      </w:pPr>
+      <w:r>
+        <w:rPr>
+          <w:rtl w:val="0"/>
+        </w:rPr>
+      </w:r>
+    </w:p>
+    <w:p>
+      <w:pPr>
+        <w:keepNext w:val="0"/>
+        <w:keepLines w:val="0"/>
+        <w:pageBreakBefore w:val="0"/>
+        <w:widowControl w:val="0"/>
+        <w:pBdr>
+          <w:top w:space="0" w:sz="0" w:val="nil"/>
+          <w:left w:space="0" w:sz="0" w:val="nil"/>
+          <w:bottom w:space="0" w:sz="0" w:val="nil"/>
+          <w:right w:space="0" w:sz="0" w:val="nil"/>
+          <w:between w:space="0" w:sz="0" w:val="nil"/>
+        </w:pBdr>
+        <w:shd w:fill="auto" w:val="clear"/>
+        <w:spacing w:after="0" w:before="0" w:line="276" w:lineRule="auto"/>
+        <w:ind w:left="0" w:right="0" w:firstLine="0"/>
+        <w:jc w:val="left"/>
+        <w:rPr/>
+      </w:pPr>
+      <w:r>
+        <w:rPr>
+          <w:rtl w:val="0"/>
+        </w:rPr>
+        <w:t xml:space="preserve">RF2 – Gestión del Núcleo Familiar</w:t>
+      </w:r>
+    </w:p>
+    <w:p>
+      <w:pPr>
+        <w:keepNext w:val="0"/>
+        <w:keepLines w:val="0"/>
+        <w:pageBreakBefore w:val="0"/>
+        <w:widowControl w:val="0"/>
+        <w:pBdr>
+          <w:top w:space="0" w:sz="0" w:val="nil"/>
+          <w:left w:space="0" w:sz="0" w:val="nil"/>
+          <w:bottom w:space="0" w:sz="0" w:val="nil"/>
+          <w:right w:space="0" w:sz="0" w:val="nil"/>
+          <w:between w:space="0" w:sz="0" w:val="nil"/>
+        </w:pBdr>
+        <w:shd w:fill="auto" w:val="clear"/>
+        <w:spacing w:after="0" w:before="0" w:line="276" w:lineRule="auto"/>
+        <w:ind w:left="0" w:right="0" w:firstLine="0"/>
+        <w:jc w:val="left"/>
+        <w:rPr/>
+      </w:pPr>
+      <w:r>
+        <w:rPr>
+          <w:rtl w:val="0"/>
+        </w:rPr>
+        <w:t xml:space="preserve">Descripción: Permite al Socio Titular declarar y mantener actualizados los integrantes de su grupo familiar.</w:t>
+      </w:r>
+    </w:p>
+    <w:p>
+      <w:pPr>
+        <w:keepNext w:val="0"/>
+        <w:keepLines w:val="0"/>
+        <w:pageBreakBefore w:val="0"/>
+        <w:widowControl w:val="0"/>
+        <w:pBdr>
+          <w:top w:space="0" w:sz="0" w:val="nil"/>
+          <w:left w:space="0" w:sz="0" w:val="nil"/>
+          <w:bottom w:space="0" w:sz="0" w:val="nil"/>
+          <w:right w:space="0" w:sz="0" w:val="nil"/>
+          <w:between w:space="0" w:sz="0" w:val="nil"/>
+        </w:pBdr>
+        <w:shd w:fill="auto" w:val="clear"/>
+        <w:spacing w:after="0" w:before="0" w:line="276" w:lineRule="auto"/>
+        <w:ind w:left="0" w:right="0" w:firstLine="0"/>
+        <w:jc w:val="left"/>
+        <w:rPr/>
+      </w:pPr>
+      <w:r>
+        <w:rPr>
+          <w:rtl w:val="0"/>
+        </w:rPr>
+        <w:t xml:space="preserve">Prioridad: Media.</w:t>
+      </w:r>
+    </w:p>
+    <w:p>
+      <w:pPr>
+        <w:keepNext w:val="0"/>
+        <w:keepLines w:val="0"/>
+        <w:pageBreakBefore w:val="0"/>
+        <w:widowControl w:val="0"/>
+        <w:pBdr>
+          <w:top w:space="0" w:sz="0" w:val="nil"/>
+          <w:left w:space="0" w:sz="0" w:val="nil"/>
+          <w:bottom w:space="0" w:sz="0" w:val="nil"/>
+          <w:right w:space="0" w:sz="0" w:val="nil"/>
+          <w:between w:space="0" w:sz="0" w:val="nil"/>
+        </w:pBdr>
+        <w:shd w:fill="auto" w:val="clear"/>
+        <w:spacing w:after="0" w:before="0" w:line="276" w:lineRule="auto"/>
+        <w:ind w:left="0" w:right="0" w:firstLine="0"/>
+        <w:jc w:val="left"/>
+        <w:rPr/>
+      </w:pPr>
+      <w:r>
+        <w:rPr>
+          <w:rtl w:val="0"/>
+        </w:rPr>
+        <w:t xml:space="preserve">Estímulo: El Socio Titular, luego de iniciar sesión, selecciona la opción "Gestionar mi grupo familiar".</w:t>
+      </w:r>
+    </w:p>
+    <w:p>
+      <w:pPr>
+        <w:keepNext w:val="0"/>
+        <w:keepLines w:val="0"/>
+        <w:pageBreakBefore w:val="0"/>
+        <w:widowControl w:val="0"/>
+        <w:pBdr>
+          <w:top w:space="0" w:sz="0" w:val="nil"/>
+          <w:left w:space="0" w:sz="0" w:val="nil"/>
+          <w:bottom w:space="0" w:sz="0" w:val="nil"/>
+          <w:right w:space="0" w:sz="0" w:val="nil"/>
+          <w:between w:space="0" w:sz="0" w:val="nil"/>
+        </w:pBdr>
+        <w:shd w:fill="auto" w:val="clear"/>
+        <w:spacing w:after="0" w:before="0" w:line="276" w:lineRule="auto"/>
+        <w:ind w:left="0" w:right="0" w:firstLine="0"/>
+        <w:jc w:val="left"/>
+        <w:rPr/>
+      </w:pPr>
+      <w:r>
+        <w:rPr>
+          <w:rtl w:val="0"/>
+        </w:rPr>
+        <w:t xml:space="preserve">Comportamiento esperado del sistema: El sistema permite agregar, modificar o eliminar integrantes del núcleo familiar, registrando el vínculo de cada integrante y manteniendo actualizada la información del grupo familiar.</w:t>
+      </w:r>
+    </w:p>
+    <w:p>
+      <w:pPr>
+        <w:keepNext w:val="0"/>
+        <w:keepLines w:val="0"/>
+        <w:pageBreakBefore w:val="0"/>
+        <w:widowControl w:val="0"/>
+        <w:pBdr>
+          <w:top w:space="0" w:sz="0" w:val="nil"/>
+          <w:left w:space="0" w:sz="0" w:val="nil"/>
+          <w:bottom w:space="0" w:sz="0" w:val="nil"/>
+          <w:right w:space="0" w:sz="0" w:val="nil"/>
+          <w:between w:space="0" w:sz="0" w:val="nil"/>
+        </w:pBdr>
+        <w:shd w:fill="auto" w:val="clear"/>
+        <w:spacing w:after="0" w:before="0" w:line="276" w:lineRule="auto"/>
+        <w:ind w:left="0" w:right="0" w:firstLine="0"/>
+        <w:jc w:val="left"/>
+        <w:rPr/>
+      </w:pPr>
+      <w:r>
+        <w:rPr>
+          <w:rtl w:val="0"/>
+        </w:rPr>
+      </w:r>
+    </w:p>
+    <w:p>
+      <w:pPr>
+        <w:keepNext w:val="0"/>
+        <w:keepLines w:val="0"/>
+        <w:pageBreakBefore w:val="0"/>
+        <w:widowControl w:val="0"/>
+        <w:pBdr>
+          <w:top w:space="0" w:sz="0" w:val="nil"/>
+          <w:left w:space="0" w:sz="0" w:val="nil"/>
+          <w:bottom w:space="0" w:sz="0" w:val="nil"/>
+          <w:right w:space="0" w:sz="0" w:val="nil"/>
+          <w:between w:space="0" w:sz="0" w:val="nil"/>
+        </w:pBdr>
+        <w:shd w:fill="auto" w:val="clear"/>
+        <w:spacing w:after="0" w:before="0" w:line="276" w:lineRule="auto"/>
+        <w:ind w:left="0" w:right="0" w:firstLine="0"/>
+        <w:jc w:val="left"/>
+        <w:rPr/>
+      </w:pPr>
+      <w:r>
+        <w:rPr>
+          <w:rtl w:val="0"/>
+        </w:rPr>
+        <w:t xml:space="preserve">RF3 – Registro de Pagos Mensuales</w:t>
+      </w:r>
+    </w:p>
+    <w:p>
+      <w:pPr>
+        <w:keepNext w:val="0"/>
+        <w:keepLines w:val="0"/>
+        <w:pageBreakBefore w:val="0"/>
+        <w:widowControl w:val="0"/>
+        <w:pBdr>
+          <w:top w:space="0" w:sz="0" w:val="nil"/>
+          <w:left w:space="0" w:sz="0" w:val="nil"/>
+          <w:bottom w:space="0" w:sz="0" w:val="nil"/>
+          <w:right w:space="0" w:sz="0" w:val="nil"/>
+          <w:between w:space="0" w:sz="0" w:val="nil"/>
+        </w:pBdr>
+        <w:shd w:fill="auto" w:val="clear"/>
+        <w:spacing w:after="0" w:before="0" w:line="276" w:lineRule="auto"/>
+        <w:ind w:left="0" w:right="0" w:firstLine="0"/>
+        <w:jc w:val="left"/>
+        <w:rPr/>
+      </w:pPr>
+      <w:r>
+        <w:rPr>
+          <w:rtl w:val="0"/>
+        </w:rPr>
+        <w:t xml:space="preserve">Descripción: Permite al Administrador registrar el pago mensual correspondiente a un núcleo familiar.</w:t>
+      </w:r>
+    </w:p>
+    <w:p>
+      <w:pPr>
+        <w:keepNext w:val="0"/>
+        <w:keepLines w:val="0"/>
+        <w:pageBreakBefore w:val="0"/>
+        <w:widowControl w:val="0"/>
+        <w:pBdr>
+          <w:top w:space="0" w:sz="0" w:val="nil"/>
+          <w:left w:space="0" w:sz="0" w:val="nil"/>
+          <w:bottom w:space="0" w:sz="0" w:val="nil"/>
+          <w:right w:space="0" w:sz="0" w:val="nil"/>
+          <w:between w:space="0" w:sz="0" w:val="nil"/>
+        </w:pBdr>
+        <w:shd w:fill="auto" w:val="clear"/>
+        <w:spacing w:after="0" w:before="0" w:line="276" w:lineRule="auto"/>
+        <w:ind w:left="0" w:right="0" w:firstLine="0"/>
+        <w:jc w:val="left"/>
+        <w:rPr/>
+      </w:pPr>
+      <w:r>
+        <w:rPr>
+          <w:rtl w:val="0"/>
+        </w:rPr>
+        <w:t xml:space="preserve">Prioridad: Alta.</w:t>
+      </w:r>
+    </w:p>
+    <w:p>
+      <w:pPr>
+        <w:keepNext w:val="0"/>
+        <w:keepLines w:val="0"/>
+        <w:pageBreakBefore w:val="0"/>
+        <w:widowControl w:val="0"/>
+        <w:pBdr>
+          <w:top w:space="0" w:sz="0" w:val="nil"/>
+          <w:left w:space="0" w:sz="0" w:val="nil"/>
+          <w:bottom w:space="0" w:sz="0" w:val="nil"/>
+          <w:right w:space="0" w:sz="0" w:val="nil"/>
+          <w:between w:space="0" w:sz="0" w:val="nil"/>
+        </w:pBdr>
+        <w:shd w:fill="auto" w:val="clear"/>
+        <w:spacing w:after="0" w:before="0" w:line="276" w:lineRule="auto"/>
+        <w:ind w:left="0" w:right="0" w:firstLine="0"/>
+        <w:jc w:val="left"/>
+        <w:rPr/>
+      </w:pPr>
+      <w:r>
+        <w:rPr>
+          <w:rtl w:val="0"/>
+        </w:rPr>
+        <w:t xml:space="preserve">Estímulo: El Administrador recibe el pago y registra la operación en el sistema.</w:t>
+      </w:r>
+    </w:p>
+    <w:p>
+      <w:pPr>
+        <w:keepNext w:val="0"/>
+        <w:keepLines w:val="0"/>
+        <w:pageBreakBefore w:val="0"/>
+        <w:widowControl w:val="0"/>
+        <w:pBdr>
+          <w:top w:space="0" w:sz="0" w:val="nil"/>
+          <w:left w:space="0" w:sz="0" w:val="nil"/>
+          <w:bottom w:space="0" w:sz="0" w:val="nil"/>
+          <w:right w:space="0" w:sz="0" w:val="nil"/>
+          <w:between w:space="0" w:sz="0" w:val="nil"/>
+        </w:pBdr>
+        <w:shd w:fill="auto" w:val="clear"/>
+        <w:spacing w:after="0" w:before="0" w:line="276" w:lineRule="auto"/>
+        <w:ind w:left="0" w:right="0" w:firstLine="0"/>
+        <w:jc w:val="left"/>
+        <w:rPr/>
+      </w:pPr>
+      <w:r>
+        <w:rPr>
+          <w:rtl w:val="0"/>
+        </w:rPr>
+        <w:t xml:space="preserve">Comportamiento esperado del sistema: El sistema valida que el monto sea mayor a 0, que la fecha del pago no sea anterior a la fecha de ingreso del socio ni al último pago registrado, y actualiza el historial de pagos del núcleo familiar.</w:t>
+      </w:r>
+    </w:p>
+    <w:p>
+      <w:pPr>
+        <w:keepNext w:val="0"/>
+        <w:keepLines w:val="0"/>
+        <w:pageBreakBefore w:val="0"/>
+        <w:widowControl w:val="0"/>
+        <w:pBdr>
+          <w:top w:space="0" w:sz="0" w:val="nil"/>
+          <w:left w:space="0" w:sz="0" w:val="nil"/>
+          <w:bottom w:space="0" w:sz="0" w:val="nil"/>
+          <w:right w:space="0" w:sz="0" w:val="nil"/>
+          <w:between w:space="0" w:sz="0" w:val="nil"/>
+        </w:pBdr>
+        <w:shd w:fill="auto" w:val="clear"/>
+        <w:spacing w:after="0" w:before="0" w:line="276" w:lineRule="auto"/>
+        <w:ind w:left="0" w:right="0" w:firstLine="0"/>
+        <w:jc w:val="left"/>
         <w:rPr>
           <w:rFonts w:ascii="Arial" w:cs="Arial" w:eastAsia="Arial" w:hAnsi="Arial"/>
           <w:b w:val="0"/>
@@ -7454,6 +7358,57 @@
         <w:spacing w:after="0" w:before="0" w:line="276" w:lineRule="auto"/>
         <w:ind w:left="0" w:right="0" w:firstLine="0"/>
         <w:jc w:val="left"/>
+        <w:rPr/>
+      </w:pPr>
+      <w:r>
+        <w:rPr>
+          <w:rtl w:val="0"/>
+        </w:rPr>
+      </w:r>
+    </w:p>
+    <w:p>
+      <w:pPr>
+        <w:keepNext w:val="0"/>
+        <w:keepLines w:val="0"/>
+        <w:pageBreakBefore w:val="0"/>
+        <w:widowControl w:val="0"/>
+        <w:pBdr>
+          <w:top w:space="0" w:sz="0" w:val="nil"/>
+          <w:left w:space="0" w:sz="0" w:val="nil"/>
+          <w:bottom w:space="0" w:sz="0" w:val="nil"/>
+          <w:right w:space="0" w:sz="0" w:val="nil"/>
+          <w:between w:space="0" w:sz="0" w:val="nil"/>
+        </w:pBdr>
+        <w:shd w:fill="auto" w:val="clear"/>
+        <w:spacing w:after="0" w:before="0" w:line="276" w:lineRule="auto"/>
+        <w:ind w:left="0" w:right="0" w:firstLine="0"/>
+        <w:jc w:val="left"/>
+        <w:rPr/>
+      </w:pPr>
+      <w:r>
+        <w:rPr>
+          <w:rtl w:val="0"/>
+        </w:rPr>
+        <w:t xml:space="preserve">SEBA:</w:t>
+      </w:r>
+    </w:p>
+    <w:p>
+      <w:pPr>
+        <w:keepNext w:val="0"/>
+        <w:keepLines w:val="0"/>
+        <w:pageBreakBefore w:val="0"/>
+        <w:widowControl w:val="0"/>
+        <w:pBdr>
+          <w:top w:space="0" w:sz="0" w:val="nil"/>
+          <w:left w:space="0" w:sz="0" w:val="nil"/>
+          <w:bottom w:space="0" w:sz="0" w:val="nil"/>
+          <w:right w:space="0" w:sz="0" w:val="nil"/>
+          <w:between w:space="0" w:sz="0" w:val="nil"/>
+        </w:pBdr>
+        <w:shd w:fill="auto" w:val="clear"/>
+        <w:spacing w:after="0" w:before="0" w:line="276" w:lineRule="auto"/>
+        <w:ind w:left="0" w:right="0" w:firstLine="0"/>
+        <w:jc w:val="left"/>
         <w:rPr>
           <w:rFonts w:ascii="Arial" w:cs="Arial" w:eastAsia="Arial" w:hAnsi="Arial"/>
           <w:b w:val="0"/>
@@ -8027,45 +7982,6 @@
       </w:pPr>
       <w:r>
         <w:rPr>
-          <w:rtl w:val="0"/>
-        </w:rPr>
-      </w:r>
-    </w:p>
-    <w:p>
-      <w:pPr>
-        <w:keepNext w:val="0"/>
-        <w:keepLines w:val="0"/>
-        <w:pageBreakBefore w:val="0"/>
-        <w:widowControl w:val="0"/>
-        <w:pBdr>
-          <w:top w:space="0" w:sz="0" w:val="nil"/>
-          <w:left w:space="0" w:sz="0" w:val="nil"/>
-          <w:bottom w:space="0" w:sz="0" w:val="nil"/>
-          <w:right w:space="0" w:sz="0" w:val="nil"/>
-          <w:between w:space="0" w:sz="0" w:val="nil"/>
-        </w:pBdr>
-        <w:shd w:fill="auto" w:val="clear"/>
-        <w:spacing w:after="0" w:before="0" w:line="276" w:lineRule="auto"/>
-        <w:ind w:left="0" w:right="0" w:firstLine="0"/>
-        <w:jc w:val="left"/>
-        <w:rPr>
-          <w:rFonts w:ascii="Arial" w:cs="Arial" w:eastAsia="Arial" w:hAnsi="Arial"/>
-          <w:b w:val="0"/>
-          <w:bCs w:val="0"/>
-          <w:i w:val="0"/>
-          <w:iCs w:val="0"/>
-          <w:smallCaps w:val="0"/>
-          <w:strike w:val="0"/>
-          <w:color w:val="000000"/>
-          <w:sz w:val="22"/>
-          <w:szCs w:val="22"/>
-          <w:u w:val="none"/>
-          <w:shd w:fill="auto" w:val="clear"/>
-          <w:vertAlign w:val="baseline"/>
-        </w:rPr>
-      </w:pPr>
-      <w:r>
-        <w:rPr>
           <w:rFonts w:ascii="Arial" w:cs="Arial" w:eastAsia="Arial" w:hAnsi="Arial"/>
           <w:b w:val="0"/>
           <w:bCs w:val="0"/>
@@ -8101,178 +8017,136 @@
         <w:spacing w:after="0" w:before="0" w:line="276" w:lineRule="auto"/>
         <w:ind w:left="0" w:right="0" w:firstLine="0"/>
         <w:jc w:val="left"/>
-        <w:rPr>
-          <w:rFonts w:ascii="Arial" w:cs="Arial" w:eastAsia="Arial" w:hAnsi="Arial"/>
-          <w:b w:val="0"/>
-          <w:bCs w:val="0"/>
-          <w:i w:val="0"/>
-          <w:iCs w:val="0"/>
-          <w:smallCaps w:val="0"/>
-          <w:strike w:val="0"/>
-          <w:color w:val="000000"/>
-          <w:sz w:val="22"/>
-          <w:szCs w:val="22"/>
-          <w:u w:val="none"/>
-          <w:shd w:fill="auto" w:val="clear"/>
-          <w:vertAlign w:val="baseline"/>
-        </w:rPr>
-      </w:pPr>
-      <w:r>
-        <w:rPr>
-          <w:rtl w:val="0"/>
-        </w:rPr>
-      </w:r>
-    </w:p>
-    <w:p>
-      <w:pPr>
-        <w:keepNext w:val="0"/>
-        <w:keepLines w:val="0"/>
-        <w:pageBreakBefore w:val="0"/>
-        <w:widowControl w:val="0"/>
-        <w:pBdr>
-          <w:top w:space="0" w:sz="0" w:val="nil"/>
-          <w:left w:space="0" w:sz="0" w:val="nil"/>
-          <w:bottom w:space="0" w:sz="0" w:val="nil"/>
-          <w:right w:space="0" w:sz="0" w:val="nil"/>
-          <w:between w:space="0" w:sz="0" w:val="nil"/>
-        </w:pBdr>
-        <w:shd w:fill="auto" w:val="clear"/>
-        <w:spacing w:after="0" w:before="0" w:line="276" w:lineRule="auto"/>
-        <w:ind w:left="0" w:right="0" w:firstLine="0"/>
-        <w:jc w:val="left"/>
-        <w:rPr>
-          <w:rFonts w:ascii="Arial" w:cs="Arial" w:eastAsia="Arial" w:hAnsi="Arial"/>
-          <w:b w:val="0"/>
-          <w:bCs w:val="0"/>
-          <w:i w:val="0"/>
-          <w:iCs w:val="0"/>
-          <w:smallCaps w:val="0"/>
-          <w:strike w:val="0"/>
-          <w:color w:val="000000"/>
-          <w:sz w:val="22"/>
-          <w:szCs w:val="22"/>
-          <w:u w:val="none"/>
-          <w:shd w:fill="auto" w:val="clear"/>
-          <w:vertAlign w:val="baseline"/>
-        </w:rPr>
-      </w:pPr>
-      <w:r>
-        <w:rPr>
-          <w:rtl w:val="0"/>
-        </w:rPr>
-      </w:r>
-    </w:p>
-    <w:p>
-      <w:pPr>
-        <w:keepNext w:val="0"/>
-        <w:keepLines w:val="0"/>
-        <w:pageBreakBefore w:val="0"/>
-        <w:widowControl w:val="0"/>
-        <w:pBdr>
-          <w:top w:space="0" w:sz="0" w:val="nil"/>
-          <w:left w:space="0" w:sz="0" w:val="nil"/>
-          <w:bottom w:space="0" w:sz="0" w:val="nil"/>
-          <w:right w:space="0" w:sz="0" w:val="nil"/>
-          <w:between w:space="0" w:sz="0" w:val="nil"/>
-        </w:pBdr>
-        <w:shd w:fill="auto" w:val="clear"/>
-        <w:spacing w:after="0" w:before="0" w:line="276" w:lineRule="auto"/>
-        <w:ind w:left="0" w:right="0" w:firstLine="0"/>
-        <w:jc w:val="left"/>
-        <w:rPr>
-          <w:rFonts w:ascii="Arial" w:cs="Arial" w:eastAsia="Arial" w:hAnsi="Arial"/>
-          <w:b w:val="0"/>
-          <w:bCs w:val="0"/>
-          <w:i w:val="0"/>
-          <w:iCs w:val="0"/>
-          <w:smallCaps w:val="0"/>
-          <w:strike w:val="0"/>
-          <w:color w:val="000000"/>
-          <w:sz w:val="22"/>
-          <w:szCs w:val="22"/>
-          <w:u w:val="none"/>
-          <w:shd w:fill="auto" w:val="clear"/>
-          <w:vertAlign w:val="baseline"/>
-        </w:rPr>
-      </w:pPr>
-      <w:r>
-        <w:rPr>
-          <w:rtl w:val="0"/>
-        </w:rPr>
-      </w:r>
-    </w:p>
-    <w:p>
-      <w:pPr>
-        <w:keepNext w:val="0"/>
-        <w:keepLines w:val="0"/>
-        <w:pageBreakBefore w:val="0"/>
-        <w:widowControl w:val="0"/>
-        <w:pBdr>
-          <w:top w:space="0" w:sz="0" w:val="nil"/>
-          <w:left w:space="0" w:sz="0" w:val="nil"/>
-          <w:bottom w:space="0" w:sz="0" w:val="nil"/>
-          <w:right w:space="0" w:sz="0" w:val="nil"/>
-          <w:between w:space="0" w:sz="0" w:val="nil"/>
-        </w:pBdr>
-        <w:shd w:fill="auto" w:val="clear"/>
-        <w:spacing w:after="0" w:before="0" w:line="276" w:lineRule="auto"/>
-        <w:ind w:left="0" w:right="0" w:firstLine="0"/>
-        <w:jc w:val="left"/>
-        <w:rPr>
-          <w:rFonts w:ascii="Arial" w:cs="Arial" w:eastAsia="Arial" w:hAnsi="Arial"/>
-          <w:b w:val="0"/>
-          <w:bCs w:val="0"/>
-          <w:i w:val="0"/>
-          <w:iCs w:val="0"/>
-          <w:smallCaps w:val="0"/>
-          <w:strike w:val="0"/>
-          <w:color w:val="000000"/>
-          <w:sz w:val="22"/>
-          <w:szCs w:val="22"/>
-          <w:u w:val="none"/>
-          <w:shd w:fill="auto" w:val="clear"/>
-          <w:vertAlign w:val="baseline"/>
-        </w:rPr>
-      </w:pPr>
-      <w:r>
-        <w:rPr>
-          <w:rtl w:val="0"/>
-        </w:rPr>
-      </w:r>
-    </w:p>
-    <w:p>
-      <w:pPr>
-        <w:keepNext w:val="0"/>
-        <w:keepLines w:val="0"/>
-        <w:pageBreakBefore w:val="0"/>
-        <w:widowControl w:val="0"/>
-        <w:pBdr>
-          <w:top w:space="0" w:sz="0" w:val="nil"/>
-          <w:left w:space="0" w:sz="0" w:val="nil"/>
-          <w:bottom w:space="0" w:sz="0" w:val="nil"/>
-          <w:right w:space="0" w:sz="0" w:val="nil"/>
-          <w:between w:space="0" w:sz="0" w:val="nil"/>
-        </w:pBdr>
-        <w:shd w:fill="auto" w:val="clear"/>
-        <w:spacing w:after="0" w:before="0" w:line="276" w:lineRule="auto"/>
-        <w:ind w:left="0" w:right="0" w:firstLine="0"/>
-        <w:jc w:val="left"/>
-        <w:rPr>
-          <w:rFonts w:ascii="Arial" w:cs="Arial" w:eastAsia="Arial" w:hAnsi="Arial"/>
-          <w:b w:val="0"/>
-          <w:bCs w:val="0"/>
-          <w:i w:val="0"/>
-          <w:iCs w:val="0"/>
-          <w:smallCaps w:val="0"/>
-          <w:strike w:val="0"/>
-          <w:color w:val="000000"/>
-          <w:sz w:val="22"/>
-          <w:szCs w:val="22"/>
-          <w:u w:val="none"/>
-          <w:shd w:fill="auto" w:val="clear"/>
-          <w:vertAlign w:val="baseline"/>
-        </w:rPr>
-      </w:pPr>
+        <w:rPr/>
+      </w:pPr>
+      <w:r>
+        <w:rPr>
+          <w:rtl w:val="0"/>
+        </w:rPr>
+        <w:t xml:space="preserve">MATEO:</w:t>
+      </w:r>
+    </w:p>
+    <w:p>
+      <w:pPr>
+        <w:keepNext w:val="0"/>
+        <w:keepLines w:val="0"/>
+        <w:pageBreakBefore w:val="0"/>
+        <w:widowControl w:val="0"/>
+        <w:pBdr>
+          <w:top w:space="0" w:sz="0" w:val="nil"/>
+          <w:left w:space="0" w:sz="0" w:val="nil"/>
+          <w:bottom w:space="0" w:sz="0" w:val="nil"/>
+          <w:right w:space="0" w:sz="0" w:val="nil"/>
+          <w:between w:space="0" w:sz="0" w:val="nil"/>
+        </w:pBdr>
+        <w:shd w:fill="auto" w:val="clear"/>
+        <w:spacing w:after="0" w:before="0" w:line="276" w:lineRule="auto"/>
+        <w:ind w:left="0" w:right="0" w:firstLine="0"/>
+        <w:jc w:val="left"/>
+        <w:rPr/>
+      </w:pPr>
+      <w:r>
+        <w:rPr>
+          <w:rtl w:val="0"/>
+        </w:rPr>
+        <w:t xml:space="preserve">Requerimientos No Funcionales</w:t>
+      </w:r>
+    </w:p>
+    <w:p>
+      <w:pPr>
+        <w:keepNext w:val="0"/>
+        <w:keepLines w:val="0"/>
+        <w:pageBreakBefore w:val="0"/>
+        <w:widowControl w:val="0"/>
+        <w:numPr>
+          <w:ilvl w:val="0"/>
+          <w:numId w:val="1"/>
+        </w:numPr>
+        <w:pBdr>
+          <w:top w:space="0" w:sz="0" w:val="nil"/>
+          <w:left w:space="0" w:sz="0" w:val="nil"/>
+          <w:bottom w:space="0" w:sz="0" w:val="nil"/>
+          <w:right w:space="0" w:sz="0" w:val="nil"/>
+          <w:between w:space="0" w:sz="0" w:val="nil"/>
+        </w:pBdr>
+        <w:shd w:fill="auto" w:val="clear"/>
+        <w:spacing w:after="0" w:before="0" w:line="276" w:lineRule="auto"/>
+        <w:ind w:left="720" w:right="0" w:hanging="360"/>
+        <w:jc w:val="left"/>
+        <w:rPr>
+          <w:u w:val="none"/>
+        </w:rPr>
+      </w:pPr>
+      <w:r>
+        <w:rPr>
+          <w:rtl w:val="0"/>
+        </w:rPr>
+        <w:t xml:space="preserve">Eficiencia: La consulta de espacios disponibles no debe superar los 2 segundos, con hasta 50 usuarios conectados a la vez.</w:t>
+      </w:r>
+    </w:p>
+    <w:p>
+      <w:pPr>
+        <w:keepNext w:val="0"/>
+        <w:keepLines w:val="0"/>
+        <w:pageBreakBefore w:val="0"/>
+        <w:widowControl w:val="0"/>
+        <w:numPr>
+          <w:ilvl w:val="0"/>
+          <w:numId w:val="1"/>
+        </w:numPr>
+        <w:pBdr>
+          <w:top w:space="0" w:sz="0" w:val="nil"/>
+          <w:left w:space="0" w:sz="0" w:val="nil"/>
+          <w:bottom w:space="0" w:sz="0" w:val="nil"/>
+          <w:right w:space="0" w:sz="0" w:val="nil"/>
+          <w:between w:space="0" w:sz="0" w:val="nil"/>
+        </w:pBdr>
+        <w:shd w:fill="auto" w:val="clear"/>
+        <w:spacing w:after="0" w:before="0" w:line="276" w:lineRule="auto"/>
+        <w:ind w:left="720" w:right="0" w:hanging="360"/>
+        <w:jc w:val="left"/>
+        <w:rPr>
+          <w:u w:val="none"/>
+        </w:rPr>
+      </w:pPr>
+      <w:r>
+        <w:rPr>
+          <w:rtl w:val="0"/>
+        </w:rPr>
+        <w:t xml:space="preserve">Seguridad lógica y de datos: El acceso al sistema requiere usuario y contraseña. Cuando un usuario tenga habilitada la autenticación en dos factores (2FA), deberá validar el segundo factor antes de ingresar al sistema. Además, se realizará un respaldo diario de la base de datos.</w:t>
+      </w:r>
+    </w:p>
+    <w:p>
+      <w:pPr>
+        <w:keepNext w:val="0"/>
+        <w:keepLines w:val="0"/>
+        <w:pageBreakBefore w:val="0"/>
+        <w:widowControl w:val="0"/>
+        <w:numPr>
+          <w:ilvl w:val="0"/>
+          <w:numId w:val="1"/>
+        </w:numPr>
+        <w:pBdr>
+          <w:top w:space="0" w:sz="0" w:val="nil"/>
+          <w:left w:space="0" w:sz="0" w:val="nil"/>
+          <w:bottom w:space="0" w:sz="0" w:val="nil"/>
+          <w:right w:space="0" w:sz="0" w:val="nil"/>
+          <w:between w:space="0" w:sz="0" w:val="nil"/>
+        </w:pBdr>
+        <w:shd w:fill="auto" w:val="clear"/>
+        <w:spacing w:after="0" w:before="0" w:line="276" w:lineRule="auto"/>
+        <w:ind w:left="720" w:right="0" w:hanging="360"/>
+        <w:jc w:val="left"/>
+        <w:rPr>
+          <w:u w:val="none"/>
+        </w:rPr>
+      </w:pPr>
+      <w:r>
+        <w:rPr>
+          <w:rtl w:val="0"/>
+        </w:rPr>
+        <w:t xml:space="preserve">Usabilidad: Un Interesado sin capacitación previa debe poder completar el formulario de afiliación en menos de 5 minutos, con mensajes de error claros y fáciles de comprender.</w:t>
+      </w:r>
       <w:r>
         <w:rPr>
           <w:rtl w:val="0"/>
@@ -8289,7 +8163,121 @@
 </file>
 
 <file path=word/numbering.xml><?xml version="1.0" encoding="utf-8"?>
-<w:numbering xmlns:mc="http://schemas.openxmlformats.org/markup-compatibility/2006" xmlns:o="urn:schemas-microsoft-com:office:office" xmlns:r="http://schemas.openxmlformats.org/officeDocument/2006/relationships" xmlns:m="http://schemas.openxmlformats.org/officeDocument/2006/math" xmlns:v="urn:schemas-microsoft-com:vml" xmlns:wp="http://schemas.openxmlformats.org/drawingml/2006/wordprocessingDrawing" xmlns:w10="urn:schemas-microsoft-com:office:word" xmlns:w="http://schemas.openxmlformats.org/wordprocessingml/2006/main" xmlns:wne="http://schemas.microsoft.com/office/word/2006/wordml" xmlns:sl="http://schemas.openxmlformats.org/schemaLibrary/2006/main" xmlns:a="http://schemas.openxmlformats.org/drawingml/2006/main" xmlns:pic="http://schemas.openxmlformats.org/drawingml/2006/picture" xmlns:c="http://schemas.openxmlformats.org/drawingml/2006/chart" xmlns:lc="http://schemas.openxmlformats.org/drawingml/2006/lockedCanvas" xmlns:dgm="http://schemas.openxmlformats.org/drawingml/2006/diagram" xmlns:wps="http://schemas.microsoft.com/office/word/2010/wordprocessingShape" xmlns:wpg="http://schemas.microsoft.com/office/word/2010/wordprocessingGroup" xmlns:w14="http://schemas.microsoft.com/office/word/2010/wordml" xmlns:w15="http://schemas.microsoft.com/office/word/2012/wordml" xmlns:w16="http://schemas.microsoft.com/office/word/2018/wordml" xmlns:w16cex="http://schemas.microsoft.com/office/word/2018/wordml/cex" xmlns:w16cid="http://schemas.microsoft.com/office/word/2016/wordml/cid" xmlns="http://schemas.microsoft.com/office/tasks/2019/documenttasks" xmlns:cr="http://schemas.microsoft.com/office/comments/2020/reactions"/>
+<w:numbering xmlns:mc="http://schemas.openxmlformats.org/markup-compatibility/2006" xmlns:o="urn:schemas-microsoft-com:office:office" xmlns:r="http://schemas.openxmlformats.org/officeDocument/2006/relationships" xmlns:m="http://schemas.openxmlformats.org/officeDocument/2006/math" xmlns:v="urn:schemas-microsoft-com:vml" xmlns:wp="http://schemas.openxmlformats.org/drawingml/2006/wordprocessingDrawing" xmlns:w10="urn:schemas-microsoft-com:office:word" xmlns:w="http://schemas.openxmlformats.org/wordprocessingml/2006/main" xmlns:wne="http://schemas.microsoft.com/office/word/2006/wordml" xmlns:sl="http://schemas.openxmlformats.org/schemaLibrary/2006/main" xmlns:a="http://schemas.openxmlformats.org/drawingml/2006/main" xmlns:pic="http://schemas.openxmlformats.org/drawingml/2006/picture" xmlns:c="http://schemas.openxmlformats.org/drawingml/2006/chart" xmlns:lc="http://schemas.openxmlformats.org/drawingml/2006/lockedCanvas" xmlns:dgm="http://schemas.openxmlformats.org/drawingml/2006/diagram" xmlns:wps="http://schemas.microsoft.com/office/word/2010/wordprocessingShape" xmlns:wpg="http://schemas.microsoft.com/office/word/2010/wordprocessingGroup" xmlns:w14="http://schemas.microsoft.com/office/word/2010/wordml" xmlns:w15="http://schemas.microsoft.com/office/word/2012/wordml" xmlns:w16="http://schemas.microsoft.com/office/word/2018/wordml" xmlns:w16cex="http://schemas.microsoft.com/office/word/2018/wordml/cex" xmlns:w16cid="http://schemas.microsoft.com/office/word/2016/wordml/cid" xmlns="http://schemas.microsoft.com/office/tasks/2019/documenttasks" xmlns:cr="http://schemas.microsoft.com/office/comments/2020/reactions">
+  <w:abstractNum w:abstractNumId="1">
+    <w:lvl w:ilvl="0">
+      <w:start w:val="1"/>
+      <w:numFmt w:val="bullet"/>
+      <w:lvlText w:val="●"/>
+      <w:lvlJc w:val="left"/>
+      <w:pPr>
+        <w:ind w:left="720" w:hanging="360"/>
+      </w:pPr>
+      <w:rPr>
+        <w:u w:val="none"/>
+      </w:rPr>
+    </w:lvl>
+    <w:lvl w:ilvl="1">
+      <w:start w:val="1"/>
+      <w:numFmt w:val="bullet"/>
+      <w:lvlText w:val="○"/>
+      <w:lvlJc w:val="left"/>
+      <w:pPr>
+        <w:ind w:left="1440" w:hanging="360"/>
+      </w:pPr>
+      <w:rPr>
+        <w:u w:val="none"/>
+      </w:rPr>
+    </w:lvl>
+    <w:lvl w:ilvl="2">
+      <w:start w:val="1"/>
+      <w:numFmt w:val="bullet"/>
+      <w:lvlText w:val="■"/>
+      <w:lvlJc w:val="left"/>
+      <w:pPr>
+        <w:ind w:left="2160" w:hanging="360"/>
+      </w:pPr>
+      <w:rPr>
+        <w:u w:val="none"/>
+      </w:rPr>
+    </w:lvl>
+    <w:lvl w:ilvl="3">
+      <w:start w:val="1"/>
+      <w:numFmt w:val="bullet"/>
+      <w:lvlText w:val="●"/>
+      <w:lvlJc w:val="left"/>
+      <w:pPr>
+        <w:ind w:left="2880" w:hanging="360"/>
+      </w:pPr>
+      <w:rPr>
+        <w:u w:val="none"/>
+      </w:rPr>
+    </w:lvl>
+    <w:lvl w:ilvl="4">
+      <w:start w:val="1"/>
+      <w:numFmt w:val="bullet"/>
+      <w:lvlText w:val="○"/>
+      <w:lvlJc w:val="left"/>
+      <w:pPr>
+        <w:ind w:left="3600" w:hanging="360"/>
+      </w:pPr>
+      <w:rPr>
+        <w:u w:val="none"/>
+      </w:rPr>
+    </w:lvl>
+    <w:lvl w:ilvl="5">
+      <w:start w:val="1"/>
+      <w:numFmt w:val="bullet"/>
+      <w:lvlText w:val="■"/>
+      <w:lvlJc w:val="left"/>
+      <w:pPr>
+        <w:ind w:left="4320" w:hanging="360"/>
+      </w:pPr>
+      <w:rPr>
+        <w:u w:val="none"/>
+      </w:rPr>
+    </w:lvl>
+    <w:lvl w:ilvl="6">
+      <w:start w:val="1"/>
+      <w:numFmt w:val="bullet"/>
+      <w:lvlText w:val="●"/>
+      <w:lvlJc w:val="left"/>
+      <w:pPr>
+        <w:ind w:left="5040" w:hanging="360"/>
+      </w:pPr>
+      <w:rPr>
+        <w:u w:val="none"/>
+      </w:rPr>
+    </w:lvl>
+    <w:lvl w:ilvl="7">
+      <w:start w:val="1"/>
+      <w:numFmt w:val="bullet"/>
+      <w:lvlText w:val="○"/>
+      <w:lvlJc w:val="left"/>
+      <w:pPr>
+        <w:ind w:left="5760" w:hanging="360"/>
+      </w:pPr>
+      <w:rPr>
+        <w:u w:val="none"/>
+      </w:rPr>
+    </w:lvl>
+    <w:lvl w:ilvl="8">
+      <w:start w:val="1"/>
+      <w:numFmt w:val="bullet"/>
+      <w:lvlText w:val="■"/>
+      <w:lvlJc w:val="left"/>
+      <w:pPr>
+        <w:ind w:left="6480" w:hanging="360"/>
+      </w:pPr>
+      <w:rPr>
+        <w:u w:val="none"/>
+      </w:rPr>
+    </w:lvl>
+  </w:abstractNum>
+  <w:num w:numId="1">
+    <w:abstractNumId w:val="1"/>
+  </w:num>
+</w:numbering>
 </file>
 
 <file path=word/styles.xml><?xml version="1.0" encoding="utf-8"?>

</xml_diff>